<commit_message>
fix(settings): move cassette B2B exclusion toggle to WooCommerce tab
- Notifications: only admin email toggles + cassette email body
- WooCommerce: toggle + group IDs after Pappou Club B2B ID; update strings
- README + admin manual docx align with new layout; bump 1.15.12

Co-authored-by: nmavragmail <nmavragmail@users.noreply.github.com>
</commit_message>
<xml_diff>
--- a/docs/Pappou-Club-Admin-Manual-el.docx
+++ b/docs/Pappou-Club-Admin-Manual-el.docx
@@ -195,7 +195,7 @@
         <w:pStyle w:val="ListBullet"/>
       </w:pPr>
       <w:r>
-        <w:t>Ειδοποιήσεις: email διαχειριστή, ενεργοποίηση emails για νέο μέλος / ολοκλήρωση referral, και ρυθμίσεις για την «Κασσετίνα — δώρο».</w:t>
+        <w:t>Ειδοποιήσεις: email διαχειριστή, ενεργοποίηση emails για νέο μέλος / ολοκλήρωση referral, και κείμενο email «Κασσετίνα Δώρο».</w:t>
       </w:r>
     </w:p>
     <w:p>
@@ -203,7 +203,7 @@
         <w:pStyle w:val="ListBullet"/>
       </w:pPr>
       <w:r>
-        <w:t>WooCommerce: πότε μετράει η παραγγελία για πόντους, κατηγορία δώρων, σύνδεση με B2B King (ομάδα Pappou Club).</w:t>
+        <w:t>WooCommerce: πότε μετράει η παραγγελία για πόντους, κατηγορία δώρων, B2B King (ομάδα Pappou Club, εξαίρεση κασσετίνας ανά ομάδες).</w:t>
       </w:r>
     </w:p>
     <w:p/>
@@ -499,7 +499,7 @@
         <w:rPr>
           <w:b w:val="0"/>
         </w:rPr>
-        <w:t>Για συγκεκριμένες ομάδες B2B King (π.χ. χονδρική), μπορείτε να κρύψετε εντελώς το section. Στις Ρυθμίσεις → Ειδοποιήσεις υπάρχει διακόπτης «Εξαίρεση κασσετίνας δώρου για B2B ομάδες» και πεδίο με IDs ομάδων (π.χ. 34). Όταν ο διακόπτης είναι ON, όσοι πελάτες ανήκουν σε αυτές τις ομάδες δεν βλέπουν το πλαίσιο. Όταν ο διακόπτης είναι OFF, η λίστα αγνοείται — δηλαδή κανείς δεν κρύβεται λόγω B2B (ούτε το 34).</w:t>
+        <w:t>Για συγκεκριμένες ομάδες B2B King (π.χ. χονδρική), μπορείτε να κρύψετε εντελώς το section. Στις Ρυθμίσεις → WooCommerce υπάρχει διακόπτης «Εξαίρεση κασσετίνας δώρου για B2B ομάδες» και πεδίο με IDs ομάδων (π.χ. 34). Όταν ο διακόπτης είναι ON, όσοι πελάτες ανήκουν σε αυτές τις ομάδες δεν βλέπουν το πλαίσιο. Όταν ο διακόπτης είναι OFF, η λίστα αγνοείται — δηλαδή κανείς δεν κρύβεται λόγω B2B (ούτε το 34).</w:t>
       </w:r>
     </w:p>
     <w:p>

</xml_diff>

<commit_message>
docs: explain docx generation workflow and refresh admin manual
- README: how build_admin_manual.py is source of truth, when to regenerate
- Manual: new intro section + WooCommerce orders list «Πόντοι» column
- Regenerate Pappou-Club-Admin-Manual-el.docx

Co-authored-by: nmavragmail <nmavragmail@users.noreply.github.com>
</commit_message>
<xml_diff>
--- a/docs/Pappou-Club-Admin-Manual-el.docx
+++ b/docs/Pappou-Club-Admin-Manual-el.docx
@@ -31,6 +31,59 @@
         <w:t>Για διαχειριστές με βασικές γνώσεις υπολογιστή και WordPress.</w:t>
         <w:br/>
         <w:t>Έκδοση εγγράφου: Απρίλιος 2026 — αντιστοιχεί στο plugin ePappous Club.</w:t>
+      </w:r>
+    </w:p>
+    <w:p>
+      <w:r>
+        <w:br w:type="page"/>
+      </w:r>
+    </w:p>
+    <w:p>
+      <w:pPr>
+        <w:pStyle w:val="Heading1"/>
+      </w:pPr>
+      <w:r>
+        <w:t>Πώς δημιουργείται αυτό το αρχείο (για διαχειριστές &amp; τεχνικούς)</w:t>
+      </w:r>
+    </w:p>
+    <w:p>
+      <w:r>
+        <w:rPr>
+          <w:b w:val="0"/>
+        </w:rPr>
+        <w:t>Το αρχείο .docx δεν γράφεται χειροκίνητα στο Word. Παράγεται αυτόματα από script στο repository, ώστε το κείμενο να μένει συγχρονισμένο με τις αλλαγές του plugin.</w:t>
+      </w:r>
+    </w:p>
+    <w:p>
+      <w:pPr>
+        <w:pStyle w:val="ListBullet"/>
+      </w:pPr>
+      <w:r>
+        <w:t>Πηγή: ο φάκελος του repo → αρχείο `docs/build_admin_manual.py` (γλώσσα Python). Εκεί βρίσκονται όλα τα κεφάλαια και οι οδηγίες σε μορφή κώδικα.</w:t>
+      </w:r>
+    </w:p>
+    <w:p>
+      <w:pPr>
+        <w:pStyle w:val="ListBullet"/>
+      </w:pPr>
+      <w:r>
+        <w:t>Για να ξαναφτιαχτεί το Word έγγραφο: από τη ρίζα του project τρέξτε `python3 docs/build_admin_manual.py` (χρειάζεται `pip install python-docx`). Θα αντικαταστήσει το `docs/Pappou-Club-Admin-Manual-el.docx` — αν είχατε επικολλήσει δικά σας screenshots μέσα στο παλιό .docx, κρατήστε αντίγραφο πριν την αναδημιουργία.</w:t>
+      </w:r>
+    </w:p>
+    <w:p>
+      <w:pPr>
+        <w:pStyle w:val="ListBullet"/>
+      </w:pPr>
+      <w:r>
+        <w:t>Οι «γκρι» εικόνες στο έγγραφο είναι θέσεις (placeholder). Αντικαταστήστε τις με Print Screen από το πραγματικό admin, όπως περιγράφεται κάτω από κάθε εικόνα.</w:t>
+      </w:r>
+    </w:p>
+    <w:p>
+      <w:pPr>
+        <w:pStyle w:val="ListBullet"/>
+      </w:pPr>
+      <w:r>
+        <w:t>Μετά από κάθε σημαντική αλλαγή στο plugin (νέες ρυθμίσεις, νέα οθόνη, αλλαγή μενού), ο συντηρητής του κώδικα πρέπει να ενημερώνει το `build_admin_manual.py` και να ξανατρέχει το script, ώστε το .docx στο GitHub να μένει επίκαιρο.</w:t>
       </w:r>
     </w:p>
     <w:p>
@@ -308,6 +361,22 @@
           <w:b w:val="0"/>
         </w:rPr>
         <w:t>Αν η παραγγελία επιστρέψει αργότερα σε κατάσταση που πάλι μετράει, οι πόντοι μπορούν να υπολογιστούν ξανά — δεν «κολλάει» μόνιμα.</w:t>
+      </w:r>
+    </w:p>
+    <w:p>
+      <w:pPr>
+        <w:pStyle w:val="Heading2"/>
+      </w:pPr>
+      <w:r>
+        <w:t>4.2 Λίστα παραγγελιών WooCommerce (στήλη «Πόντοι»)</w:t>
+      </w:r>
+    </w:p>
+    <w:p>
+      <w:r>
+        <w:rPr>
+          <w:b w:val="0"/>
+        </w:rPr>
+        <w:t>Στο WooCommerce → Παραγγελίες (οθόνη με `page=wc-orders` όταν είναι ενεργό HPOS) εμφανίζεται στήλη «Πόντοι». Δείχνει το καθαρό αποτέλεσμα για την παραγγελία: πόντοι που κερδίστηκαν μείον εξαργύρωση στο checkout και πόντοι που χρεώθηκαν για δώρα. Θετικό ποσό εμφανίζεται με +, αρνητικό χωρίς πρόσημο. Αν η παραγγελία δεν αφορά μέλος του Pappou Club (B2B ομάδα) ή το club είναι κλειστό, εμφανίζεται —.</w:t>
       </w:r>
     </w:p>
     <w:p>

</xml_diff>

<commit_message>
ci: auto-regenerate admin manual docx on push to main
- GitHub Actions workflow rebuilds docx after every main push; commits only if changed
- build_admin_manual.py: deterministic docx zip (stable core.xml + entry order)
- README + manual intro: document CI workflow; optional local build

Co-authored-by: nmavragmail <nmavragmail@users.noreply.github.com>
</commit_message>
<xml_diff>
--- a/docs/Pappou-Club-Admin-Manual-el.docx
+++ b/docs/Pappou-Club-Admin-Manual-el.docx
@@ -83,7 +83,15 @@
         <w:pStyle w:val="ListBullet"/>
       </w:pPr>
       <w:r>
-        <w:t>Μετά από κάθε σημαντική αλλαγή στο plugin (νέες ρυθμίσεις, νέα οθόνη, αλλαγή μενού), ο συντηρητής του κώδικα πρέπει να ενημερώνει το `build_admin_manual.py` και να ξανατρέχει το script, ώστε το .docx στο GitHub να μένει επίκαιρο.</w:t>
+        <w:t>Μετά από κάθε merge στο branch main, το GitHub Actions (workflow «Regenerate admin manual») ξανατρέχει το script και, αν άλλαξε το περιεχόμενο του .docx, κάνει αυτόματα commit το νέο αρχείο — δεν χρειάζεται να τρέχετε εσείς Python τοπικά.</w:t>
+      </w:r>
+    </w:p>
+    <w:p>
+      <w:pPr>
+        <w:pStyle w:val="ListBullet"/>
+      </w:pPr>
+      <w:r>
+        <w:t>Όταν αλλάζει κάτι στο plugin που πρέπει να εμφανίζεται στο εγχειρίδιο, ο συντηρητής του κώδικα ενημερώνει το `build_admin_manual.py` στο ίδιο commit· μετά το merge στο main το workflow ανανεώνει το .docx στο repository.</w:t>
       </w:r>
     </w:p>
     <w:p>

</xml_diff>